<commit_message>
create ticket tracking srs - update sdd of manage backlog
</commit_message>
<xml_diff>
--- a/jira_clone/report/SDD_ManageBacklog.docx
+++ b/jira_clone/report/SDD_ManageBacklog.docx
@@ -12,7 +12,7 @@
           <w:noProof/>
         </w:rPr>
         <w:drawing>
-          <wp:inline distT="0" distB="0" distL="0" distR="0" wp14:anchorId="457E777A" wp14:editId="1FBA519F">
+          <wp:inline distT="0" distB="0" distL="0" distR="0" wp14:anchorId="7850CFC6" wp14:editId="4F3FCC40">
             <wp:extent cx="2857500" cy="2857500"/>
             <wp:effectExtent l="0" t="0" r="0" b="0"/>
             <wp:docPr id="1" name="logo" descr="Soft Retail logo" title="Soft Retail"/>
@@ -420,30 +420,66 @@
           <w:sz w:val="18"/>
           <w:szCs w:val="18"/>
         </w:rPr>
-        <w:t xml:space="preserve">(), enrichTickets(), formatTicket()           </w:t>
-      </w:r>
+        <w:t xml:space="preserve">(), </w:t>
+      </w:r>
+      <w:proofErr w:type="spellStart"/>
       <w:r>
         <w:rPr>
           <w:rFonts w:ascii="Consolas" w:hAnsi="Consolas" w:cs="Consolas"/>
           <w:sz w:val="18"/>
           <w:szCs w:val="18"/>
         </w:rPr>
-        <w:t xml:space="preserve"> </w:t>
-      </w:r>
+        <w:t>enrichTickets</w:t>
+      </w:r>
+      <w:proofErr w:type="spellEnd"/>
       <w:r>
         <w:rPr>
           <w:rFonts w:ascii="Consolas" w:hAnsi="Consolas" w:cs="Consolas"/>
           <w:sz w:val="18"/>
           <w:szCs w:val="18"/>
         </w:rPr>
-        <w:t xml:space="preserve"> │</w:t>
-      </w:r>
+        <w:t xml:space="preserve">(), </w:t>
+      </w:r>
+      <w:proofErr w:type="spellStart"/>
       <w:r>
         <w:rPr>
           <w:rFonts w:ascii="Consolas" w:hAnsi="Consolas" w:cs="Consolas"/>
           <w:sz w:val="18"/>
           <w:szCs w:val="18"/>
         </w:rPr>
+        <w:t>formatTicket</w:t>
+      </w:r>
+      <w:proofErr w:type="spellEnd"/>
+      <w:r>
+        <w:rPr>
+          <w:rFonts w:ascii="Consolas" w:hAnsi="Consolas" w:cs="Consolas"/>
+          <w:sz w:val="18"/>
+          <w:szCs w:val="18"/>
+        </w:rPr>
+        <w:t xml:space="preserve">()           </w:t>
+      </w:r>
+      <w:r>
+        <w:rPr>
+          <w:rFonts w:ascii="Consolas" w:hAnsi="Consolas" w:cs="Consolas"/>
+          <w:sz w:val="18"/>
+          <w:szCs w:val="18"/>
+        </w:rPr>
+        <w:t xml:space="preserve"> </w:t>
+      </w:r>
+      <w:r>
+        <w:rPr>
+          <w:rFonts w:ascii="Consolas" w:hAnsi="Consolas" w:cs="Consolas"/>
+          <w:sz w:val="18"/>
+          <w:szCs w:val="18"/>
+        </w:rPr>
+        <w:t xml:space="preserve"> │</w:t>
+      </w:r>
+      <w:r>
+        <w:rPr>
+          <w:rFonts w:ascii="Consolas" w:hAnsi="Consolas" w:cs="Consolas"/>
+          <w:sz w:val="18"/>
+          <w:szCs w:val="18"/>
+        </w:rPr>
         <w:br/>
         <w:t>│                                                                                       │</w:t>
       </w:r>
@@ -623,7 +659,25 @@
           <w:sz w:val="18"/>
           <w:szCs w:val="18"/>
         </w:rPr>
-        <w:t xml:space="preserve"> · TicketService · StatusService · EpicService · ProjectService ·</w:t>
+        <w:t xml:space="preserve"> · </w:t>
+      </w:r>
+      <w:proofErr w:type="spellStart"/>
+      <w:r>
+        <w:rPr>
+          <w:rFonts w:ascii="Consolas" w:hAnsi="Consolas" w:cs="Consolas"/>
+          <w:sz w:val="18"/>
+          <w:szCs w:val="18"/>
+        </w:rPr>
+        <w:t>TicketService</w:t>
+      </w:r>
+      <w:proofErr w:type="spellEnd"/>
+      <w:r>
+        <w:rPr>
+          <w:rFonts w:ascii="Consolas" w:hAnsi="Consolas" w:cs="Consolas"/>
+          <w:sz w:val="18"/>
+          <w:szCs w:val="18"/>
+        </w:rPr>
+        <w:t xml:space="preserve"> · StatusService · EpicService · ProjectService ·</w:t>
       </w:r>
       <w:r>
         <w:rPr>
@@ -5759,24 +5813,102 @@
           <w:szCs w:val="18"/>
         </w:rPr>
         <w:t>ticket row click → ticketviewopen → handleOpenTicketView sets _activeTicketViewId</w:t>
+      </w:r>
+      <w:r>
+        <w:rPr>
+          <w:rFonts w:ascii="Consolas" w:hAnsi="Consolas" w:cs="Consolas"/>
+          <w:sz w:val="18"/>
+          <w:szCs w:val="18"/>
+        </w:rPr>
         <w:br/>
         <w:t>render &lt;c-ticket-view ticket={activeTicket}&gt;</w:t>
+      </w:r>
+      <w:r>
+        <w:rPr>
+          <w:rFonts w:ascii="Consolas" w:hAnsi="Consolas" w:cs="Consolas"/>
+          <w:sz w:val="18"/>
+          <w:szCs w:val="18"/>
+        </w:rPr>
         <w:br/>
         <w:t xml:space="preserve">  ├─ ticketsummaryupdate     → updateTicketSummary   → _updateTicketSummaryEverywhere</w:t>
+      </w:r>
+      <w:r>
+        <w:rPr>
+          <w:rFonts w:ascii="Consolas" w:hAnsi="Consolas" w:cs="Consolas"/>
+          <w:sz w:val="18"/>
+          <w:szCs w:val="18"/>
+        </w:rPr>
         <w:br/>
+      </w:r>
+      <w:r>
+        <w:rPr>
+          <w:rFonts w:ascii="Consolas" w:hAnsi="Consolas" w:cs="Consolas"/>
+          <w:sz w:val="18"/>
+          <w:szCs w:val="18"/>
+        </w:rPr>
+        <w:lastRenderedPageBreak/>
         <w:t xml:space="preserve">  ├─ ticketstatuschange      → changeTicketState     → _updateTicketStateEverywhere</w:t>
+      </w:r>
+      <w:r>
+        <w:rPr>
+          <w:rFonts w:ascii="Consolas" w:hAnsi="Consolas" w:cs="Consolas"/>
+          <w:sz w:val="18"/>
+          <w:szCs w:val="18"/>
+        </w:rPr>
         <w:br/>
         <w:t xml:space="preserve">  ├─ ticketdescriptionupdate → updateTicketDescription</w:t>
+      </w:r>
+      <w:r>
+        <w:rPr>
+          <w:rFonts w:ascii="Consolas" w:hAnsi="Consolas" w:cs="Consolas"/>
+          <w:sz w:val="18"/>
+          <w:szCs w:val="18"/>
+        </w:rPr>
         <w:br/>
         <w:t xml:space="preserve">  ├─ ticketlinkedtoexpand    → set _linkedToTargetTicketId → @wire loadTicketLinkedTo</w:t>
+      </w:r>
+      <w:r>
+        <w:rPr>
+          <w:rFonts w:ascii="Consolas" w:hAnsi="Consolas" w:cs="Consolas"/>
+          <w:sz w:val="18"/>
+          <w:szCs w:val="18"/>
+        </w:rPr>
         <w:br/>
         <w:t xml:space="preserve">  ├─ ticketsearch (≥2 chars) → set _ticketViewSearchTerm   → @wire loadTicketBySearchTerm</w:t>
+      </w:r>
+      <w:r>
+        <w:rPr>
+          <w:rFonts w:ascii="Consolas" w:hAnsi="Consolas" w:cs="Consolas"/>
+          <w:sz w:val="18"/>
+          <w:szCs w:val="18"/>
+        </w:rPr>
         <w:br/>
         <w:t xml:space="preserve">  ├─ ticketlinkcreate        → linkToTicket          → _addLinkedTicketToTicket</w:t>
+      </w:r>
+      <w:r>
+        <w:rPr>
+          <w:rFonts w:ascii="Consolas" w:hAnsi="Consolas" w:cs="Consolas"/>
+          <w:sz w:val="18"/>
+          <w:szCs w:val="18"/>
+        </w:rPr>
         <w:br/>
         <w:t xml:space="preserve">  ├─ subtasksexpand          → set _subtasksTargetTicketId → @wire loadSubtasks</w:t>
+      </w:r>
+      <w:r>
+        <w:rPr>
+          <w:rFonts w:ascii="Consolas" w:hAnsi="Consolas" w:cs="Consolas"/>
+          <w:sz w:val="18"/>
+          <w:szCs w:val="18"/>
+        </w:rPr>
         <w:br/>
         <w:t xml:space="preserve">  ├─ subtaskcreate           → createSubtask         → _addSubtaskToTicket</w:t>
+      </w:r>
+      <w:r>
+        <w:rPr>
+          <w:rFonts w:ascii="Consolas" w:hAnsi="Consolas" w:cs="Consolas"/>
+          <w:sz w:val="18"/>
+          <w:szCs w:val="18"/>
+        </w:rPr>
         <w:br/>
         <w:t xml:space="preserve">  └─ closeticketview         → clear _activeTicketViewId</w:t>
       </w:r>
@@ -5786,7 +5918,6 @@
         <w:pStyle w:val="Heading2"/>
       </w:pPr>
       <w:r>
-        <w:lastRenderedPageBreak/>
         <w:t>4. UI / UX Specification</w:t>
       </w:r>
     </w:p>
@@ -5953,7 +6084,7 @@
           <w:noProof/>
         </w:rPr>
         <w:drawing>
-          <wp:inline distT="0" distB="0" distL="0" distR="0" wp14:anchorId="49DA137B" wp14:editId="4E2A43E7">
+          <wp:inline distT="0" distB="0" distL="0" distR="0" wp14:anchorId="5D8B8DB0" wp14:editId="4DC77BFE">
             <wp:extent cx="5943600" cy="1361810"/>
             <wp:effectExtent l="0" t="0" r="0" b="0"/>
             <wp:docPr id="2000" name="Picture 2000"/>
@@ -6151,8 +6282,9 @@
         <w:rPr>
           <w:noProof/>
         </w:rPr>
+        <w:lastRenderedPageBreak/>
         <w:drawing>
-          <wp:inline distT="0" distB="0" distL="0" distR="0" wp14:anchorId="467BD62D" wp14:editId="17D44D59">
+          <wp:inline distT="0" distB="0" distL="0" distR="0" wp14:anchorId="78EC9E0E" wp14:editId="287876AC">
             <wp:extent cx="5943600" cy="1473173"/>
             <wp:effectExtent l="0" t="0" r="0" b="0"/>
             <wp:docPr id="2001" name="Picture 2001"/>
@@ -6278,7 +6410,6 @@
         <w:ind w:left="360" w:hanging="240"/>
       </w:pPr>
       <w:r>
-        <w:lastRenderedPageBreak/>
         <w:t xml:space="preserve">•  </w:t>
       </w:r>
       <w:r>
@@ -6479,7 +6610,7 @@
           <w:noProof/>
         </w:rPr>
         <w:drawing>
-          <wp:inline distT="0" distB="0" distL="0" distR="0" wp14:anchorId="46A8105F" wp14:editId="3888D977">
+          <wp:inline distT="0" distB="0" distL="0" distR="0" wp14:anchorId="306D7A6E" wp14:editId="72FE8E8C">
             <wp:extent cx="5943600" cy="858167"/>
             <wp:effectExtent l="0" t="0" r="0" b="0"/>
             <wp:docPr id="2002" name="Picture 2002"/>
@@ -6687,8 +6818,9 @@
         <w:rPr>
           <w:noProof/>
         </w:rPr>
+        <w:lastRenderedPageBreak/>
         <w:drawing>
-          <wp:inline distT="0" distB="0" distL="0" distR="0" wp14:anchorId="750B729C" wp14:editId="5338B658">
+          <wp:inline distT="0" distB="0" distL="0" distR="0" wp14:anchorId="2AAF80BB" wp14:editId="29EA40C1">
             <wp:extent cx="5943600" cy="2304532"/>
             <wp:effectExtent l="0" t="0" r="0" b="0"/>
             <wp:docPr id="2003" name="Picture 2003"/>
@@ -6764,7 +6896,6 @@
           <w:sz w:val="16"/>
           <w:szCs w:val="16"/>
         </w:rPr>
-        <w:lastRenderedPageBreak/>
         <w:t>###########################</w:t>
       </w:r>
     </w:p>
@@ -6868,7 +6999,7 @@
           <w:noProof/>
         </w:rPr>
         <w:drawing>
-          <wp:inline distT="0" distB="0" distL="0" distR="0" wp14:anchorId="41B8288F" wp14:editId="50F8C094">
+          <wp:inline distT="0" distB="0" distL="0" distR="0" wp14:anchorId="1AC2F625" wp14:editId="4469AE9A">
             <wp:extent cx="5943600" cy="2425316"/>
             <wp:effectExtent l="0" t="0" r="0" b="0"/>
             <wp:docPr id="2004" name="Picture 2004"/>
@@ -7048,6 +7179,7 @@
           <w:b/>
           <w:bCs/>
         </w:rPr>
+        <w:lastRenderedPageBreak/>
         <w:t>Create</w:t>
       </w:r>
       <w:r>
@@ -7139,9 +7271,8 @@
         <w:rPr>
           <w:noProof/>
         </w:rPr>
-        <w:lastRenderedPageBreak/>
         <w:drawing>
-          <wp:inline distT="0" distB="0" distL="0" distR="0" wp14:anchorId="7200C44E" wp14:editId="2277DCAC">
+          <wp:inline distT="0" distB="0" distL="0" distR="0" wp14:anchorId="255C1686" wp14:editId="58D8DE95">
             <wp:extent cx="5943600" cy="2381892"/>
             <wp:effectExtent l="0" t="0" r="0" b="0"/>
             <wp:docPr id="2005" name="Picture 2005"/>
@@ -7380,7 +7511,7 @@
           <w:noProof/>
         </w:rPr>
         <w:drawing>
-          <wp:inline distT="0" distB="0" distL="0" distR="0" wp14:anchorId="6B598188" wp14:editId="63CB3072">
+          <wp:inline distT="0" distB="0" distL="0" distR="0" wp14:anchorId="12DFD40C" wp14:editId="2FD682A3">
             <wp:extent cx="5943600" cy="99865"/>
             <wp:effectExtent l="0" t="0" r="0" b="0"/>
             <wp:docPr id="2006" name="Picture 2006"/>
@@ -7558,8 +7689,9 @@
         <w:rPr>
           <w:noProof/>
         </w:rPr>
+        <w:lastRenderedPageBreak/>
         <w:drawing>
-          <wp:inline distT="0" distB="0" distL="0" distR="0" wp14:anchorId="050E70F1" wp14:editId="160F73C4">
+          <wp:inline distT="0" distB="0" distL="0" distR="0" wp14:anchorId="535E7C7B" wp14:editId="6ADA6FA5">
             <wp:extent cx="5943600" cy="723430"/>
             <wp:effectExtent l="0" t="0" r="0" b="0"/>
             <wp:docPr id="2007" name="Picture 2007"/>
@@ -7643,7 +7775,6 @@
         <w:pStyle w:val="Heading3"/>
       </w:pPr>
       <w:r>
-        <w:lastRenderedPageBreak/>
         <w:t>4.9 Expand ticket — sub-tasks list</w:t>
       </w:r>
     </w:p>
@@ -7719,7 +7850,7 @@
           <w:noProof/>
         </w:rPr>
         <w:drawing>
-          <wp:inline distT="0" distB="0" distL="0" distR="0" wp14:anchorId="69D8F21A" wp14:editId="42CCCFB9">
+          <wp:inline distT="0" distB="0" distL="0" distR="0" wp14:anchorId="58F9FB89" wp14:editId="09339482">
             <wp:extent cx="5943600" cy="427256"/>
             <wp:effectExtent l="0" t="0" r="0" b="0"/>
             <wp:docPr id="2008" name="Picture 2008"/>
@@ -7948,7 +8079,7 @@
           <w:noProof/>
         </w:rPr>
         <w:drawing>
-          <wp:inline distT="0" distB="0" distL="0" distR="0" wp14:anchorId="4649C4D9" wp14:editId="17118E1A">
+          <wp:inline distT="0" distB="0" distL="0" distR="0" wp14:anchorId="1AD4FB9F" wp14:editId="77C5C5AB">
             <wp:extent cx="5943600" cy="2509520"/>
             <wp:effectExtent l="0" t="0" r="0" b="0"/>
             <wp:docPr id="2009" name="Picture 2009"/>
@@ -8032,6 +8163,7 @@
         <w:pStyle w:val="Heading3"/>
       </w:pPr>
       <w:r>
+        <w:lastRenderedPageBreak/>
         <w:t>4.11 Update Epic Parent modal (epic label → choose existing or create new)</w:t>
       </w:r>
     </w:p>
@@ -8188,9 +8320,8 @@
         <w:rPr>
           <w:noProof/>
         </w:rPr>
-        <w:lastRenderedPageBreak/>
         <w:drawing>
-          <wp:inline distT="0" distB="0" distL="0" distR="0" wp14:anchorId="17854A0C" wp14:editId="6F767696">
+          <wp:inline distT="0" distB="0" distL="0" distR="0" wp14:anchorId="793D3930" wp14:editId="3CC7E13F">
             <wp:extent cx="4314825" cy="3981450"/>
             <wp:effectExtent l="0" t="0" r="0" b="0"/>
             <wp:docPr id="2010" name="Picture 2010"/>
@@ -8286,7 +8417,15 @@
           <w:b/>
           <w:bCs/>
         </w:rPr>
-        <w:t>Clicking a ticket row dispatches ticketviewopen and opens the right-side c-ticket-view panel for that ticket (the parent keeps _activeTicketViewId and feeds the panel via _findTicketById). The header shows the ticket Name and a Close (×). Body sections: Summary — click the title to edit inline (c-ao-input) with confirm (✓) / cancel (✕), saving via ticketsummaryupdate → updateTicketSummary. Status — a combo box bound to statusOptions that fires ticketstatuschange → changeTicketState. Description — rendered with lightning-formatted-rich-text; clicking it (or the “Add a description…” placeholder when empty) swaps in a lightning-input-rich-text editor with Save / Cancel (ticketdescriptionupdate → updateTicketDescription). Linked work items — a collapsible section; expanding fires ticketlinkedtoexpand (@wire loadTicketLinkedTo) and lists the items under the blocks label; the + reveals an add-link form with a Link-type combo (loadTicketLinkedToType) and a ticket auto-complete that searches on ≥ 2 characters (ticketsearch → @wire loadTicketBySearchTerm), with Cancel / Link — Link is enabled only once both a type and a target ticket are chosen (linkToTicket). Subtasks — a collapsible section; expanding fires subtasksexpand (@wire loadSubtasks) and lists each sub-task (name, summary, assignee); the + reveals an inline create form (Summary *, Assignee, Current State, Start Date, Story Point, Description) with Cancel / Create (subtaskcreate → createSubtask).</w:t>
+        <w:t xml:space="preserve">Clicking a ticket row dispatches ticketviewopen and opens the right-side c-ticket-view panel for that ticket (the parent keeps _activeTicketViewId and feeds the panel via _findTicketById). The header shows the ticket Name and a Close (×). Body sections: Summary — click the title to edit inline (c-ao-input) with confirm (✓) / cancel (✕), saving via ticketsummaryupdate → updateTicketSummary. Status — a combo box bound to statusOptions that fires ticketstatuschange → changeTicketState. Description — rendered with lightning-formatted-rich-text; clicking it (or the “Add a description…” placeholder when empty) swaps in a lightning-input-rich-text editor </w:t>
+      </w:r>
+      <w:r>
+        <w:rPr>
+          <w:b/>
+          <w:bCs/>
+        </w:rPr>
+        <w:lastRenderedPageBreak/>
+        <w:t>with Save / Cancel (ticketdescriptionupdate → updateTicketDescription). Linked work items — a collapsible section; expanding fires ticketlinkedtoexpand (@wire loadTicketLinkedTo) and lists the items under the blocks label; the + reveals an add-link form with a Link-type combo (loadTicketLinkedToType) and a ticket auto-complete that searches on ≥ 2 characters (ticketsearch → @wire loadTicketBySearchTerm), with Cancel / Link — Link is enabled only once both a type and a target ticket are chosen (linkToTicket). Subtasks — a collapsible section; expanding fires subtasksexpand (@wire loadSubtasks) and lists each sub-task (name, summary, assignee); the + reveals an inline create form (Summary *, Assignee, Current State, Start Date, Story Point, Description) with Cancel / Create (subtaskcreate → createSubtask).</w:t>
       </w:r>
     </w:p>
     <w:p>
@@ -8305,14 +8444,27 @@
     </w:p>
     <w:p>
       <w:pPr>
-        <w:spacing w:after="160" w:line="276" w:lineRule="auto"/>
+        <w:jc w:val="center"/>
       </w:pPr>
       <w:r>
         <w:rPr>
           <w:b/>
           <w:bCs/>
-        </w:rPr>
-        <w:t>ticket-view-panel.png</w:t>
+          <w:color w:val="0F4761"/>
+          <w:sz w:val="20"/>
+          <w:szCs w:val="20"/>
+        </w:rPr>
+        <w:t>Ticket-view-panel</w:t>
+      </w:r>
+      <w:r>
+        <w:rPr>
+          <w:b/>
+          <w:bCs/>
+          <w:color w:val="0F4761"/>
+          <w:sz w:val="20"/>
+          <w:szCs w:val="20"/>
+        </w:rPr>
+        <w:t>.png</w:t>
       </w:r>
     </w:p>
     <w:p>
@@ -8334,11 +8486,41 @@
         <w:spacing w:after="160" w:line="276" w:lineRule="auto"/>
       </w:pPr>
       <w:r>
-        <w:rPr>
-          <w:b/>
-          <w:bCs/>
-        </w:rPr>
-        <w:t/>
+        <w:drawing>
+          <wp:inline distT="0" distB="0" distL="0" distR="0" wp14:anchorId="0E734966" wp14:editId="308925CA">
+            <wp:extent cx="5943600" cy="2445385"/>
+            <wp:effectExtent l="0" t="0" r="0" b="0"/>
+            <wp:docPr id="177086350" name="Picture 1"/>
+            <wp:cNvGraphicFramePr>
+              <a:graphicFrameLocks xmlns:a="http://schemas.openxmlformats.org/drawingml/2006/main" noChangeAspect="1"/>
+            </wp:cNvGraphicFramePr>
+            <a:graphic xmlns:a="http://schemas.openxmlformats.org/drawingml/2006/main">
+              <a:graphicData uri="http://schemas.openxmlformats.org/drawingml/2006/picture">
+                <pic:pic xmlns:pic="http://schemas.openxmlformats.org/drawingml/2006/picture">
+                  <pic:nvPicPr>
+                    <pic:cNvPr id="177086350" name=""/>
+                    <pic:cNvPicPr/>
+                  </pic:nvPicPr>
+                  <pic:blipFill>
+                    <a:blip r:embed="rId17"/>
+                    <a:stretch>
+                      <a:fillRect/>
+                    </a:stretch>
+                  </pic:blipFill>
+                  <pic:spPr>
+                    <a:xfrm>
+                      <a:off x="0" y="0"/>
+                      <a:ext cx="5943600" cy="2445385"/>
+                    </a:xfrm>
+                    <a:prstGeom prst="rect">
+                      <a:avLst/>
+                    </a:prstGeom>
+                  </pic:spPr>
+                </pic:pic>
+              </a:graphicData>
+            </a:graphic>
+          </wp:inline>
+        </w:drawing>
       </w:r>
     </w:p>
     <w:p>
@@ -8357,14 +8539,37 @@
     </w:p>
     <w:p>
       <w:pPr>
-        <w:spacing w:after="160" w:line="276" w:lineRule="auto"/>
+        <w:jc w:val="center"/>
       </w:pPr>
       <w:r>
         <w:rPr>
           <w:b/>
           <w:bCs/>
-        </w:rPr>
-        <w:t>ticket-view-status-combo.png</w:t>
+          <w:color w:val="0F4761"/>
+          <w:sz w:val="20"/>
+          <w:szCs w:val="20"/>
+        </w:rPr>
+        <w:t>Ticket-view-</w:t>
+      </w:r>
+      <w:r>
+        <w:rPr>
+          <w:b/>
+          <w:bCs/>
+          <w:color w:val="0F4761"/>
+          <w:sz w:val="20"/>
+          <w:szCs w:val="20"/>
+        </w:rPr>
+        <w:t>status-combo</w:t>
+      </w:r>
+      <w:r>
+        <w:rPr>
+          <w:b/>
+          <w:bCs/>
+          <w:color w:val="0F4761"/>
+          <w:sz w:val="20"/>
+          <w:szCs w:val="20"/>
+        </w:rPr>
+        <w:t>.png</w:t>
       </w:r>
     </w:p>
     <w:p>
@@ -8383,67 +8588,72 @@
     </w:p>
     <w:p>
       <w:pPr>
+        <w:jc w:val="center"/>
+      </w:pPr>
+      <w:r>
+        <w:drawing>
+          <wp:inline distT="0" distB="0" distL="0" distR="0" wp14:anchorId="5F854840" wp14:editId="44D80161">
+            <wp:extent cx="5943600" cy="1807845"/>
+            <wp:effectExtent l="0" t="0" r="0" b="1905"/>
+            <wp:docPr id="945312477" name="Picture 1"/>
+            <wp:cNvGraphicFramePr>
+              <a:graphicFrameLocks xmlns:a="http://schemas.openxmlformats.org/drawingml/2006/main" noChangeAspect="1"/>
+            </wp:cNvGraphicFramePr>
+            <a:graphic xmlns:a="http://schemas.openxmlformats.org/drawingml/2006/main">
+              <a:graphicData uri="http://schemas.openxmlformats.org/drawingml/2006/picture">
+                <pic:pic xmlns:pic="http://schemas.openxmlformats.org/drawingml/2006/picture">
+                  <pic:nvPicPr>
+                    <pic:cNvPr id="945312477" name=""/>
+                    <pic:cNvPicPr/>
+                  </pic:nvPicPr>
+                  <pic:blipFill>
+                    <a:blip r:embed="rId18"/>
+                    <a:stretch>
+                      <a:fillRect/>
+                    </a:stretch>
+                  </pic:blipFill>
+                  <pic:spPr>
+                    <a:xfrm>
+                      <a:off x="0" y="0"/>
+                      <a:ext cx="5943600" cy="1807845"/>
+                    </a:xfrm>
+                    <a:prstGeom prst="rect">
+                      <a:avLst/>
+                    </a:prstGeom>
+                  </pic:spPr>
+                </pic:pic>
+              </a:graphicData>
+            </a:graphic>
+          </wp:inline>
+        </w:drawing>
+      </w:r>
+    </w:p>
+    <w:p>
+      <w:pPr>
         <w:spacing w:after="160" w:line="276" w:lineRule="auto"/>
       </w:pPr>
-      <w:r>
-        <w:rPr>
-          <w:b/>
-          <w:bCs/>
-        </w:rPr>
-        <w:t/>
-      </w:r>
     </w:p>
     <w:p>
       <w:pPr>
         <w:jc w:val="center"/>
-      </w:pPr>
-      <w:r>
         <w:rPr>
           <w:rFonts w:ascii="Consolas" w:hAnsi="Consolas" w:cs="Consolas"/>
           <w:color w:val="9AA0A6"/>
           <w:sz w:val="16"/>
           <w:szCs w:val="16"/>
         </w:rPr>
-        <w:t>###########################</w:t>
-      </w:r>
-    </w:p>
-    <w:p>
-      <w:pPr>
-        <w:spacing w:after="160" w:line="276" w:lineRule="auto"/>
-      </w:pPr>
-      <w:r>
-        <w:rPr>
-          <w:b/>
-          <w:bCs/>
-        </w:rPr>
-        <w:t>ticket-view-linked-work-items.png</w:t>
-      </w:r>
+      </w:pPr>
     </w:p>
     <w:p>
       <w:pPr>
         <w:jc w:val="center"/>
-      </w:pPr>
-      <w:r>
         <w:rPr>
           <w:rFonts w:ascii="Consolas" w:hAnsi="Consolas" w:cs="Consolas"/>
           <w:color w:val="9AA0A6"/>
           <w:sz w:val="16"/>
           <w:szCs w:val="16"/>
         </w:rPr>
-        <w:t>###########################</w:t>
-      </w:r>
-    </w:p>
-    <w:p>
-      <w:pPr>
-        <w:spacing w:after="160" w:line="276" w:lineRule="auto"/>
-      </w:pPr>
-      <w:r>
-        <w:rPr>
-          <w:b/>
-          <w:bCs/>
-        </w:rPr>
-        <w:t/>
-      </w:r>
+      </w:pPr>
     </w:p>
     <w:p>
       <w:pPr>
@@ -8456,19 +8666,43 @@
           <w:sz w:val="16"/>
           <w:szCs w:val="16"/>
         </w:rPr>
+        <w:lastRenderedPageBreak/>
         <w:t>###########################</w:t>
       </w:r>
     </w:p>
     <w:p>
       <w:pPr>
-        <w:spacing w:after="160" w:line="276" w:lineRule="auto"/>
+        <w:jc w:val="center"/>
       </w:pPr>
       <w:r>
         <w:rPr>
           <w:b/>
           <w:bCs/>
-        </w:rPr>
-        <w:t>ticket-view-link-form.png</w:t>
+          <w:color w:val="0F4761"/>
+          <w:sz w:val="20"/>
+          <w:szCs w:val="20"/>
+        </w:rPr>
+        <w:t>Ticket-view-</w:t>
+      </w:r>
+      <w:r>
+        <w:rPr>
+          <w:b/>
+          <w:bCs/>
+          <w:color w:val="0F4761"/>
+          <w:sz w:val="20"/>
+          <w:szCs w:val="20"/>
+        </w:rPr>
+        <w:t>description-editor</w:t>
+      </w:r>
+      <w:r>
+        <w:rPr>
+          <w:b/>
+          <w:bCs/>
+          <w:color w:val="0F4761"/>
+          <w:sz w:val="20"/>
+          <w:szCs w:val="20"/>
+        </w:rPr>
+        <w:t>.png</w:t>
       </w:r>
     </w:p>
     <w:p>
@@ -8490,11 +8724,41 @@
         <w:spacing w:after="160" w:line="276" w:lineRule="auto"/>
       </w:pPr>
       <w:r>
-        <w:rPr>
-          <w:b/>
-          <w:bCs/>
-        </w:rPr>
-        <w:t/>
+        <w:drawing>
+          <wp:inline distT="0" distB="0" distL="0" distR="0" wp14:anchorId="28EB322A" wp14:editId="6FCFCF38">
+            <wp:extent cx="5943600" cy="1079500"/>
+            <wp:effectExtent l="0" t="0" r="0" b="6350"/>
+            <wp:docPr id="1907764812" name="Picture 1"/>
+            <wp:cNvGraphicFramePr>
+              <a:graphicFrameLocks xmlns:a="http://schemas.openxmlformats.org/drawingml/2006/main" noChangeAspect="1"/>
+            </wp:cNvGraphicFramePr>
+            <a:graphic xmlns:a="http://schemas.openxmlformats.org/drawingml/2006/main">
+              <a:graphicData uri="http://schemas.openxmlformats.org/drawingml/2006/picture">
+                <pic:pic xmlns:pic="http://schemas.openxmlformats.org/drawingml/2006/picture">
+                  <pic:nvPicPr>
+                    <pic:cNvPr id="1907764812" name=""/>
+                    <pic:cNvPicPr/>
+                  </pic:nvPicPr>
+                  <pic:blipFill>
+                    <a:blip r:embed="rId19"/>
+                    <a:stretch>
+                      <a:fillRect/>
+                    </a:stretch>
+                  </pic:blipFill>
+                  <pic:spPr>
+                    <a:xfrm>
+                      <a:off x="0" y="0"/>
+                      <a:ext cx="5943600" cy="1079500"/>
+                    </a:xfrm>
+                    <a:prstGeom prst="rect">
+                      <a:avLst/>
+                    </a:prstGeom>
+                  </pic:spPr>
+                </pic:pic>
+              </a:graphicData>
+            </a:graphic>
+          </wp:inline>
+        </w:drawing>
       </w:r>
     </w:p>
     <w:p>
@@ -8513,14 +8777,57 @@
     </w:p>
     <w:p>
       <w:pPr>
-        <w:spacing w:after="160" w:line="276" w:lineRule="auto"/>
+        <w:jc w:val="center"/>
       </w:pPr>
       <w:r>
         <w:rPr>
           <w:b/>
           <w:bCs/>
-        </w:rPr>
-        <w:t>ticket-view-subtasks.png</w:t>
+          <w:color w:val="0F4761"/>
+          <w:sz w:val="20"/>
+          <w:szCs w:val="20"/>
+        </w:rPr>
+        <w:t>Ticket-view-</w:t>
+      </w:r>
+      <w:r>
+        <w:rPr>
+          <w:b/>
+          <w:bCs/>
+          <w:color w:val="0F4761"/>
+          <w:sz w:val="20"/>
+          <w:szCs w:val="20"/>
+        </w:rPr>
+        <w:t>linked</w:t>
+      </w:r>
+      <w:r>
+        <w:rPr>
+          <w:b/>
+          <w:bCs/>
+          <w:color w:val="0F4761"/>
+          <w:sz w:val="20"/>
+          <w:szCs w:val="20"/>
+        </w:rPr>
+        <w:t>-</w:t>
+      </w:r>
+      <w:r>
+        <w:rPr>
+          <w:b/>
+          <w:bCs/>
+          <w:color w:val="0F4761"/>
+          <w:sz w:val="20"/>
+          <w:szCs w:val="20"/>
+        </w:rPr>
+        <w:t>work-items</w:t>
+      </w:r>
+      <w:r>
+        <w:rPr>
+          <w:b/>
+          <w:bCs/>
+          <w:color w:val="0F4761"/>
+          <w:sz w:val="20"/>
+          <w:szCs w:val="20"/>
+        </w:rPr>
+        <w:t>.png</w:t>
       </w:r>
     </w:p>
     <w:p>
@@ -8542,11 +8849,83 @@
         <w:spacing w:after="160" w:line="276" w:lineRule="auto"/>
       </w:pPr>
       <w:r>
-        <w:rPr>
-          <w:b/>
-          <w:bCs/>
-        </w:rPr>
-        <w:t/>
+        <w:drawing>
+          <wp:inline distT="0" distB="0" distL="0" distR="0" wp14:anchorId="6925DBDD" wp14:editId="3D3144A3">
+            <wp:extent cx="5943600" cy="1136650"/>
+            <wp:effectExtent l="0" t="0" r="0" b="6350"/>
+            <wp:docPr id="38610706" name="Picture 1"/>
+            <wp:cNvGraphicFramePr>
+              <a:graphicFrameLocks xmlns:a="http://schemas.openxmlformats.org/drawingml/2006/main" noChangeAspect="1"/>
+            </wp:cNvGraphicFramePr>
+            <a:graphic xmlns:a="http://schemas.openxmlformats.org/drawingml/2006/main">
+              <a:graphicData uri="http://schemas.openxmlformats.org/drawingml/2006/picture">
+                <pic:pic xmlns:pic="http://schemas.openxmlformats.org/drawingml/2006/picture">
+                  <pic:nvPicPr>
+                    <pic:cNvPr id="38610706" name=""/>
+                    <pic:cNvPicPr/>
+                  </pic:nvPicPr>
+                  <pic:blipFill>
+                    <a:blip r:embed="rId20"/>
+                    <a:stretch>
+                      <a:fillRect/>
+                    </a:stretch>
+                  </pic:blipFill>
+                  <pic:spPr>
+                    <a:xfrm>
+                      <a:off x="0" y="0"/>
+                      <a:ext cx="5943600" cy="1136650"/>
+                    </a:xfrm>
+                    <a:prstGeom prst="rect">
+                      <a:avLst/>
+                    </a:prstGeom>
+                  </pic:spPr>
+                </pic:pic>
+              </a:graphicData>
+            </a:graphic>
+          </wp:inline>
+        </w:drawing>
+      </w:r>
+    </w:p>
+    <w:p>
+      <w:pPr>
+        <w:spacing w:after="160" w:line="276" w:lineRule="auto"/>
+      </w:pPr>
+      <w:r>
+        <w:drawing>
+          <wp:inline distT="0" distB="0" distL="0" distR="0" wp14:anchorId="7FB33FB6" wp14:editId="360FBECB">
+            <wp:extent cx="5943600" cy="696595"/>
+            <wp:effectExtent l="0" t="0" r="0" b="8255"/>
+            <wp:docPr id="709922268" name="Picture 1"/>
+            <wp:cNvGraphicFramePr>
+              <a:graphicFrameLocks xmlns:a="http://schemas.openxmlformats.org/drawingml/2006/main" noChangeAspect="1"/>
+            </wp:cNvGraphicFramePr>
+            <a:graphic xmlns:a="http://schemas.openxmlformats.org/drawingml/2006/main">
+              <a:graphicData uri="http://schemas.openxmlformats.org/drawingml/2006/picture">
+                <pic:pic xmlns:pic="http://schemas.openxmlformats.org/drawingml/2006/picture">
+                  <pic:nvPicPr>
+                    <pic:cNvPr id="709922268" name=""/>
+                    <pic:cNvPicPr/>
+                  </pic:nvPicPr>
+                  <pic:blipFill>
+                    <a:blip r:embed="rId21"/>
+                    <a:stretch>
+                      <a:fillRect/>
+                    </a:stretch>
+                  </pic:blipFill>
+                  <pic:spPr>
+                    <a:xfrm>
+                      <a:off x="0" y="0"/>
+                      <a:ext cx="5943600" cy="696595"/>
+                    </a:xfrm>
+                    <a:prstGeom prst="rect">
+                      <a:avLst/>
+                    </a:prstGeom>
+                  </pic:spPr>
+                </pic:pic>
+              </a:graphicData>
+            </a:graphic>
+          </wp:inline>
+        </w:drawing>
       </w:r>
     </w:p>
     <w:p>
@@ -8565,14 +8944,57 @@
     </w:p>
     <w:p>
       <w:pPr>
-        <w:spacing w:after="160" w:line="276" w:lineRule="auto"/>
+        <w:jc w:val="center"/>
       </w:pPr>
       <w:r>
         <w:rPr>
           <w:b/>
           <w:bCs/>
-        </w:rPr>
-        <w:t>ticket-view-subtask-form.png</w:t>
+          <w:color w:val="0F4761"/>
+          <w:sz w:val="20"/>
+          <w:szCs w:val="20"/>
+        </w:rPr>
+        <w:t>Ticket-view-</w:t>
+      </w:r>
+      <w:r>
+        <w:rPr>
+          <w:b/>
+          <w:bCs/>
+          <w:color w:val="0F4761"/>
+          <w:sz w:val="20"/>
+          <w:szCs w:val="20"/>
+        </w:rPr>
+        <w:t>subtask</w:t>
+      </w:r>
+      <w:r>
+        <w:rPr>
+          <w:b/>
+          <w:bCs/>
+          <w:color w:val="0F4761"/>
+          <w:sz w:val="20"/>
+          <w:szCs w:val="20"/>
+        </w:rPr>
+        <w:t>-</w:t>
+      </w:r>
+      <w:r>
+        <w:rPr>
+          <w:b/>
+          <w:bCs/>
+          <w:color w:val="0F4761"/>
+          <w:sz w:val="20"/>
+          <w:szCs w:val="20"/>
+        </w:rPr>
+        <w:t>form</w:t>
+      </w:r>
+      <w:r>
+        <w:rPr>
+          <w:b/>
+          <w:bCs/>
+          <w:color w:val="0F4761"/>
+          <w:sz w:val="20"/>
+          <w:szCs w:val="20"/>
+        </w:rPr>
+        <w:t>.png</w:t>
       </w:r>
     </w:p>
     <w:p>
@@ -8591,22 +9013,177 @@
     </w:p>
     <w:p>
       <w:pPr>
+        <w:jc w:val="center"/>
+      </w:pPr>
+      <w:r>
+        <w:drawing>
+          <wp:inline distT="0" distB="0" distL="0" distR="0" wp14:anchorId="2017D99D" wp14:editId="5CF5B75A">
+            <wp:extent cx="5943600" cy="929005"/>
+            <wp:effectExtent l="0" t="0" r="0" b="4445"/>
+            <wp:docPr id="270902386" name="Picture 1"/>
+            <wp:cNvGraphicFramePr>
+              <a:graphicFrameLocks xmlns:a="http://schemas.openxmlformats.org/drawingml/2006/main" noChangeAspect="1"/>
+            </wp:cNvGraphicFramePr>
+            <a:graphic xmlns:a="http://schemas.openxmlformats.org/drawingml/2006/main">
+              <a:graphicData uri="http://schemas.openxmlformats.org/drawingml/2006/picture">
+                <pic:pic xmlns:pic="http://schemas.openxmlformats.org/drawingml/2006/picture">
+                  <pic:nvPicPr>
+                    <pic:cNvPr id="270902386" name=""/>
+                    <pic:cNvPicPr/>
+                  </pic:nvPicPr>
+                  <pic:blipFill>
+                    <a:blip r:embed="rId22"/>
+                    <a:stretch>
+                      <a:fillRect/>
+                    </a:stretch>
+                  </pic:blipFill>
+                  <pic:spPr>
+                    <a:xfrm>
+                      <a:off x="0" y="0"/>
+                      <a:ext cx="5943600" cy="929005"/>
+                    </a:xfrm>
+                    <a:prstGeom prst="rect">
+                      <a:avLst/>
+                    </a:prstGeom>
+                  </pic:spPr>
+                </pic:pic>
+              </a:graphicData>
+            </a:graphic>
+          </wp:inline>
+        </w:drawing>
+      </w:r>
+      <w:r>
+        <w:drawing>
+          <wp:inline distT="0" distB="0" distL="0" distR="0" wp14:anchorId="36FE84BB" wp14:editId="3FCCBCC5">
+            <wp:extent cx="5943600" cy="1816735"/>
+            <wp:effectExtent l="0" t="0" r="0" b="0"/>
+            <wp:docPr id="2132816670" name="Picture 1"/>
+            <wp:cNvGraphicFramePr>
+              <a:graphicFrameLocks xmlns:a="http://schemas.openxmlformats.org/drawingml/2006/main" noChangeAspect="1"/>
+            </wp:cNvGraphicFramePr>
+            <a:graphic xmlns:a="http://schemas.openxmlformats.org/drawingml/2006/main">
+              <a:graphicData uri="http://schemas.openxmlformats.org/drawingml/2006/picture">
+                <pic:pic xmlns:pic="http://schemas.openxmlformats.org/drawingml/2006/picture">
+                  <pic:nvPicPr>
+                    <pic:cNvPr id="2132816670" name=""/>
+                    <pic:cNvPicPr/>
+                  </pic:nvPicPr>
+                  <pic:blipFill>
+                    <a:blip r:embed="rId23"/>
+                    <a:stretch>
+                      <a:fillRect/>
+                    </a:stretch>
+                  </pic:blipFill>
+                  <pic:spPr>
+                    <a:xfrm>
+                      <a:off x="0" y="0"/>
+                      <a:ext cx="5943600" cy="1816735"/>
+                    </a:xfrm>
+                    <a:prstGeom prst="rect">
+                      <a:avLst/>
+                    </a:prstGeom>
+                  </pic:spPr>
+                </pic:pic>
+              </a:graphicData>
+            </a:graphic>
+          </wp:inline>
+        </w:drawing>
+      </w:r>
+    </w:p>
+    <w:p>
+      <w:pPr>
         <w:spacing w:after="160" w:line="276" w:lineRule="auto"/>
       </w:pPr>
+    </w:p>
+    <w:p>
+      <w:pPr>
+        <w:pStyle w:val="Heading2"/>
+      </w:pPr>
+      <w:r>
+        <w:lastRenderedPageBreak/>
+        <w:t>5. State, Paging &amp; Drag-and-Drop Design</w:t>
+      </w:r>
+    </w:p>
+    <w:p>
+      <w:pPr>
+        <w:spacing w:after="60" w:line="276" w:lineRule="auto"/>
+        <w:ind w:left="360" w:hanging="240"/>
+      </w:pPr>
+      <w:r>
+        <w:t xml:space="preserve">•  </w:t>
+      </w:r>
       <w:r>
         <w:rPr>
           <w:b/>
           <w:bCs/>
         </w:rPr>
-        <w:t/>
-      </w:r>
-    </w:p>
-    <w:p>
-      <w:pPr>
-        <w:pStyle w:val="Heading2"/>
-      </w:pPr>
-      <w:r>
-        <w:t>5. State, Paging &amp; Drag-and-Drop Design</w:t>
+        <w:t>Paging.</w:t>
+      </w:r>
+      <w:r>
+        <w:t xml:space="preserve"> </w:t>
+      </w:r>
+      <w:r>
+        <w:rPr>
+          <w:rFonts w:ascii="Consolas" w:hAnsi="Consolas" w:cs="Consolas"/>
+          <w:sz w:val="20"/>
+          <w:szCs w:val="20"/>
+        </w:rPr>
+        <w:t>PAGE_SIZE = 5</w:t>
+      </w:r>
+      <w:r>
+        <w:t xml:space="preserve"> (</w:t>
+      </w:r>
+      <w:r>
+        <w:rPr>
+          <w:rFonts w:ascii="Consolas" w:hAnsi="Consolas" w:cs="Consolas"/>
+          <w:sz w:val="20"/>
+          <w:szCs w:val="20"/>
+        </w:rPr>
+        <w:t>backlogSprintUtils.js</w:t>
+      </w:r>
+      <w:r>
+        <w:t xml:space="preserve">). Backlog tracks </w:t>
+      </w:r>
+      <w:r>
+        <w:rPr>
+          <w:rFonts w:ascii="Consolas" w:hAnsi="Consolas" w:cs="Consolas"/>
+          <w:sz w:val="20"/>
+          <w:szCs w:val="20"/>
+        </w:rPr>
+        <w:t>backlogOffset / backlogHasMore</w:t>
+      </w:r>
+      <w:r>
+        <w:t>;</w:t>
+      </w:r>
+    </w:p>
+    <w:p>
+      <w:pPr>
+        <w:spacing w:after="160" w:line="276" w:lineRule="auto"/>
+      </w:pPr>
+      <w:r>
+        <w:t xml:space="preserve">each sprint tracks its own </w:t>
+      </w:r>
+      <w:r>
+        <w:rPr>
+          <w:rFonts w:ascii="Consolas" w:hAnsi="Consolas" w:cs="Consolas"/>
+          <w:sz w:val="20"/>
+          <w:szCs w:val="20"/>
+        </w:rPr>
+        <w:t>offset / hasMore / currentPage / isFirstPage / isLastPage / offsetLabel</w:t>
+      </w:r>
+      <w:r>
+        <w:t xml:space="preserve">. "has more" is inferred from </w:t>
+      </w:r>
+      <w:r>
+        <w:rPr>
+          <w:rFonts w:ascii="Consolas" w:hAnsi="Consolas" w:cs="Consolas"/>
+          <w:sz w:val="20"/>
+          <w:szCs w:val="20"/>
+        </w:rPr>
+        <w:t>rawTickets.length === PAGE_SIZE</w:t>
+      </w:r>
+      <w:r>
+        <w:t>.</w:t>
       </w:r>
     </w:p>
     <w:p>
@@ -8622,7 +9199,7 @@
           <w:b/>
           <w:bCs/>
         </w:rPr>
-        <w:t>Paging.</w:t>
+        <w:t>Derived sprint view-model.</w:t>
       </w:r>
       <w:r>
         <w:t xml:space="preserve"> </w:t>
@@ -8633,10 +9210,10 @@
           <w:sz w:val="20"/>
           <w:szCs w:val="20"/>
         </w:rPr>
-        <w:t>PAGE_SIZE = 5</w:t>
-      </w:r>
-      <w:r>
-        <w:t xml:space="preserve"> (</w:t>
+        <w:t>formatSprint(raw)</w:t>
+      </w:r>
+      <w:r>
+        <w:t xml:space="preserve"> adds </w:t>
       </w:r>
       <w:r>
         <w:rPr>
@@ -8644,29 +9221,26 @@
           <w:sz w:val="20"/>
           <w:szCs w:val="20"/>
         </w:rPr>
-        <w:t>backlogSprintUtils.js</w:t>
-      </w:r>
-      <w:r>
-        <w:t xml:space="preserve">). Backlog tracks </w:t>
-      </w:r>
+        <w:t>endDate</w:t>
+      </w:r>
+      <w:r>
+        <w:t xml:space="preserve"> (= start + duration days),</w:t>
+      </w:r>
+    </w:p>
+    <w:p>
+      <w:pPr>
+        <w:spacing w:after="160" w:line="276" w:lineRule="auto"/>
+      </w:pPr>
       <w:r>
         <w:rPr>
           <w:rFonts w:ascii="Consolas" w:hAnsi="Consolas" w:cs="Consolas"/>
           <w:sz w:val="20"/>
           <w:szCs w:val="20"/>
         </w:rPr>
-        <w:t>backlogOffset / backlogHasMore</w:t>
-      </w:r>
-      <w:r>
-        <w:t>;</w:t>
-      </w:r>
-    </w:p>
-    <w:p>
-      <w:pPr>
-        <w:spacing w:after="160" w:line="276" w:lineRule="auto"/>
-      </w:pPr>
-      <w:r>
-        <w:t xml:space="preserve">each sprint tracks its own </w:t>
+        <w:t>isComplete</w:t>
+      </w:r>
+      <w:r>
+        <w:t xml:space="preserve">, </w:t>
       </w:r>
       <w:r>
         <w:rPr>
@@ -8674,10 +9248,29 @@
           <w:sz w:val="20"/>
           <w:szCs w:val="20"/>
         </w:rPr>
-        <w:t>offset / hasMore / currentPage / isFirstPage / isLastPage / offsetLabel</w:t>
-      </w:r>
-      <w:r>
-        <w:t xml:space="preserve">. "has more" is inferred from </w:t>
+        <w:t>storyPointsPercent</w:t>
+      </w:r>
+      <w:r>
+        <w:t>, chevron/expansion/paging defaults, and drag-feedback classes.</w:t>
+      </w:r>
+    </w:p>
+    <w:p>
+      <w:pPr>
+        <w:spacing w:after="60" w:line="276" w:lineRule="auto"/>
+        <w:ind w:left="360" w:hanging="240"/>
+      </w:pPr>
+      <w:r>
+        <w:t xml:space="preserve">•  </w:t>
+      </w:r>
+      <w:r>
+        <w:rPr>
+          <w:b/>
+          <w:bCs/>
+        </w:rPr>
+        <w:t>Derived ticket view-model.</w:t>
+      </w:r>
+      <w:r>
+        <w:t xml:space="preserve"> </w:t>
       </w:r>
       <w:r>
         <w:rPr>
@@ -8685,7 +9278,89 @@
           <w:sz w:val="20"/>
           <w:szCs w:val="20"/>
         </w:rPr>
-        <w:t>rawTickets.length === PAGE_SIZE</w:t>
+        <w:t>enrichTickets(...)</w:t>
+      </w:r>
+      <w:r>
+        <w:t xml:space="preserve"> / </w:t>
+      </w:r>
+      <w:r>
+        <w:rPr>
+          <w:rFonts w:ascii="Consolas" w:hAnsi="Consolas" w:cs="Consolas"/>
+          <w:sz w:val="20"/>
+          <w:szCs w:val="20"/>
+        </w:rPr>
+        <w:t>formatTicket(...)</w:t>
+      </w:r>
+      <w:r>
+        <w:t xml:space="preserve"> map </w:t>
+      </w:r>
+      <w:r>
+        <w:rPr>
+          <w:rFonts w:ascii="Consolas" w:hAnsi="Consolas" w:cs="Consolas"/>
+          <w:sz w:val="20"/>
+          <w:szCs w:val="20"/>
+        </w:rPr>
+        <w:t>epicName</w:t>
+      </w:r>
+      <w:r>
+        <w:t>,</w:t>
+      </w:r>
+    </w:p>
+    <w:p>
+      <w:pPr>
+        <w:spacing w:after="160" w:line="276" w:lineRule="auto"/>
+      </w:pPr>
+      <w:r>
+        <w:rPr>
+          <w:rFonts w:ascii="Consolas" w:hAnsi="Consolas" w:cs="Consolas"/>
+          <w:sz w:val="20"/>
+          <w:szCs w:val="20"/>
+        </w:rPr>
+        <w:t>ticketTypeName</w:t>
+      </w:r>
+      <w:r>
+        <w:t xml:space="preserve">, </w:t>
+      </w:r>
+      <w:r>
+        <w:rPr>
+          <w:rFonts w:ascii="Consolas" w:hAnsi="Consolas" w:cs="Consolas"/>
+          <w:sz w:val="20"/>
+          <w:szCs w:val="20"/>
+        </w:rPr>
+        <w:t>assigneeName</w:t>
+      </w:r>
+      <w:r>
+        <w:t xml:space="preserve">, </w:t>
+      </w:r>
+      <w:r>
+        <w:rPr>
+          <w:rFonts w:ascii="Consolas" w:hAnsi="Consolas" w:cs="Consolas"/>
+          <w:sz w:val="20"/>
+          <w:szCs w:val="20"/>
+        </w:rPr>
+        <w:t>isSelected</w:t>
+      </w:r>
+      <w:r>
+        <w:t xml:space="preserve">, a stable </w:t>
+      </w:r>
+      <w:r>
+        <w:rPr>
+          <w:rFonts w:ascii="Consolas" w:hAnsi="Consolas" w:cs="Consolas"/>
+          <w:sz w:val="20"/>
+          <w:szCs w:val="20"/>
+        </w:rPr>
+        <w:t>_key</w:t>
+      </w:r>
+      <w:r>
+        <w:t xml:space="preserve">, and </w:t>
+      </w:r>
+      <w:r>
+        <w:rPr>
+          <w:rFonts w:ascii="Consolas" w:hAnsi="Consolas" w:cs="Consolas"/>
+          <w:sz w:val="20"/>
+          <w:szCs w:val="20"/>
+        </w:rPr>
+        <w:t>dropIndicatorClass</w:t>
       </w:r>
       <w:r>
         <w:t>.</w:t>
@@ -8704,10 +9379,18 @@
           <w:b/>
           <w:bCs/>
         </w:rPr>
-        <w:t>Derived sprint view-model.</w:t>
-      </w:r>
-      <w:r>
-        <w:t xml:space="preserve"> </w:t>
+        <w:t>Mutators are "everywhere"-aware.</w:t>
+      </w:r>
+      <w:r>
+        <w:t xml:space="preserve"> Because a ticket can appear in the backlog and (when loaded)</w:t>
+      </w:r>
+    </w:p>
+    <w:p>
+      <w:pPr>
+        <w:spacing w:after="160" w:line="276" w:lineRule="auto"/>
+      </w:pPr>
+      <w:r>
+        <w:t xml:space="preserve">in a sprint, patches go through </w:t>
       </w:r>
       <w:r>
         <w:rPr>
@@ -8715,10 +9398,10 @@
           <w:sz w:val="20"/>
           <w:szCs w:val="20"/>
         </w:rPr>
-        <w:t>formatSprint(raw)</w:t>
-      </w:r>
-      <w:r>
-        <w:t xml:space="preserve"> adds </w:t>
+        <w:t>_patchTicketEverywhere</w:t>
+      </w:r>
+      <w:r>
+        <w:t xml:space="preserve"> / </w:t>
       </w:r>
       <w:r>
         <w:rPr>
@@ -8726,26 +9409,48 @@
           <w:sz w:val="20"/>
           <w:szCs w:val="20"/>
         </w:rPr>
-        <w:t>endDate</w:t>
-      </w:r>
-      <w:r>
-        <w:t xml:space="preserve"> (= start + duration days),</w:t>
-      </w:r>
-    </w:p>
-    <w:p>
-      <w:pPr>
-        <w:spacing w:after="160" w:line="276" w:lineRule="auto"/>
-      </w:pPr>
+        <w:t>_updateTicket…Everywhere</w:t>
+      </w:r>
+      <w:r>
+        <w:t xml:space="preserve"> so both copies stay consistent without a second fetch.</w:t>
+      </w:r>
+    </w:p>
+    <w:p>
+      <w:pPr>
+        <w:spacing w:after="60" w:line="276" w:lineRule="auto"/>
+        <w:ind w:left="360" w:hanging="240"/>
+      </w:pPr>
+      <w:r>
+        <w:t xml:space="preserve">•  </w:t>
+      </w:r>
+      <w:r>
+        <w:rPr>
+          <w:b/>
+          <w:bCs/>
+        </w:rPr>
+        <w:t>Drag and drop.</w:t>
+      </w:r>
+      <w:r>
+        <w:t xml:space="preserve"> </w:t>
+      </w:r>
       <w:r>
         <w:rPr>
           <w:rFonts w:ascii="Consolas" w:hAnsi="Consolas" w:cs="Consolas"/>
           <w:sz w:val="20"/>
           <w:szCs w:val="20"/>
         </w:rPr>
-        <w:t>isComplete</w:t>
-      </w:r>
-      <w:r>
-        <w:t xml:space="preserve">, </w:t>
+        <w:t>handlePageDragStart</w:t>
+      </w:r>
+      <w:r>
+        <w:t xml:space="preserve"> records the source container/ticket via DOM traversal</w:t>
+      </w:r>
+    </w:p>
+    <w:p>
+      <w:pPr>
+        <w:spacing w:after="160" w:line="276" w:lineRule="auto"/>
+      </w:pPr>
+      <w:r>
+        <w:t xml:space="preserve">(dataTransfer is empty on </w:t>
       </w:r>
       <w:r>
         <w:rPr>
@@ -8753,10 +9458,54 @@
           <w:sz w:val="20"/>
           <w:szCs w:val="20"/>
         </w:rPr>
-        <w:t>storyPointsPercent</w:t>
-      </w:r>
-      <w:r>
-        <w:t>, chevron/expansion/paging defaults, and drag-feedback classes.</w:t>
+        <w:t>dragstart</w:t>
+      </w:r>
+      <w:r>
+        <w:t>). Sprint→different-sprint is blocked (</w:t>
+      </w:r>
+      <w:r>
+        <w:rPr>
+          <w:rFonts w:ascii="Consolas" w:hAnsi="Consolas" w:cs="Consolas"/>
+          <w:sz w:val="20"/>
+          <w:szCs w:val="20"/>
+        </w:rPr>
+        <w:t>dropEffect='none'</w:t>
+      </w:r>
+      <w:r>
+        <w:t xml:space="preserve">). Same-container drops route to </w:t>
+      </w:r>
+      <w:r>
+        <w:rPr>
+          <w:rFonts w:ascii="Consolas" w:hAnsi="Consolas" w:cs="Consolas"/>
+          <w:sz w:val="20"/>
+          <w:szCs w:val="20"/>
+        </w:rPr>
+        <w:t>moveTicketPosition</w:t>
+      </w:r>
+      <w:r>
+        <w:t xml:space="preserve"> (reorder); cross-container drops route to </w:t>
+      </w:r>
+      <w:r>
+        <w:rPr>
+          <w:rFonts w:ascii="Consolas" w:hAnsi="Consolas" w:cs="Consolas"/>
+          <w:sz w:val="20"/>
+          <w:szCs w:val="20"/>
+        </w:rPr>
+        <w:t>moveTicketToSprint</w:t>
+      </w:r>
+      <w:r>
+        <w:t xml:space="preserve"> / </w:t>
+      </w:r>
+      <w:r>
+        <w:rPr>
+          <w:rFonts w:ascii="Consolas" w:hAnsi="Consolas" w:cs="Consolas"/>
+          <w:sz w:val="20"/>
+          <w:szCs w:val="20"/>
+        </w:rPr>
+        <w:t>moveTicketToBacklog</w:t>
+      </w:r>
+      <w:r>
+        <w:t>. Top drop-zones allow inserting before the first item.</w:t>
       </w:r>
     </w:p>
     <w:p>
@@ -8772,10 +9521,10 @@
           <w:b/>
           <w:bCs/>
         </w:rPr>
-        <w:t>Derived ticket view-model.</w:t>
-      </w:r>
-      <w:r>
-        <w:t xml:space="preserve"> </w:t>
+        <w:t>Optimistic revert.</w:t>
+      </w:r>
+      <w:r>
+        <w:t xml:space="preserve"> On a failed status change the ticket is re-keyed (</w:t>
       </w:r>
       <w:r>
         <w:rPr>
@@ -8783,10 +9532,35 @@
           <w:sz w:val="20"/>
           <w:szCs w:val="20"/>
         </w:rPr>
-        <w:t>enrichTickets(...)</w:t>
-      </w:r>
-      <w:r>
-        <w:t xml:space="preserve"> / </w:t>
+        <w:t>_reKeyTicket</w:t>
+      </w:r>
+      <w:r>
+        <w:t>) to force the</w:t>
+      </w:r>
+    </w:p>
+    <w:p>
+      <w:pPr>
+        <w:spacing w:after="160" w:line="276" w:lineRule="auto"/>
+      </w:pPr>
+      <w:r>
+        <w:t>combo to re-render its server value.</w:t>
+      </w:r>
+    </w:p>
+    <w:p>
+      <w:pPr>
+        <w:pStyle w:val="Heading2"/>
+      </w:pPr>
+      <w:r>
+        <w:t>6. Error Handling &amp; Loading</w:t>
+      </w:r>
+    </w:p>
+    <w:p>
+      <w:pPr>
+        <w:spacing w:after="60" w:line="276" w:lineRule="auto"/>
+        <w:ind w:left="360" w:hanging="240"/>
+      </w:pPr>
+      <w:r>
+        <w:t xml:space="preserve">•  Each imperative call sets </w:t>
       </w:r>
       <w:r>
         <w:rPr>
@@ -8794,10 +9568,10 @@
           <w:sz w:val="20"/>
           <w:szCs w:val="20"/>
         </w:rPr>
-        <w:t>formatTicket(...)</w:t>
-      </w:r>
-      <w:r>
-        <w:t xml:space="preserve"> map </w:t>
+        <w:t>isLoading = true</w:t>
+      </w:r>
+      <w:r>
+        <w:t xml:space="preserve">, then in </w:t>
       </w:r>
       <w:r>
         <w:rPr>
@@ -8805,26 +9579,26 @@
           <w:sz w:val="20"/>
           <w:szCs w:val="20"/>
         </w:rPr>
-        <w:t>epicName</w:t>
-      </w:r>
-      <w:r>
-        <w:t>,</w:t>
-      </w:r>
-    </w:p>
-    <w:p>
-      <w:pPr>
-        <w:spacing w:after="160" w:line="276" w:lineRule="auto"/>
-      </w:pPr>
+        <w:t>finally</w:t>
+      </w:r>
+      <w:r>
+        <w:t xml:space="preserve"> resets it; </w:t>
+      </w:r>
       <w:r>
         <w:rPr>
           <w:rFonts w:ascii="Consolas" w:hAnsi="Consolas" w:cs="Consolas"/>
           <w:sz w:val="20"/>
           <w:szCs w:val="20"/>
         </w:rPr>
-        <w:t>ticketTypeName</w:t>
-      </w:r>
-      <w:r>
-        <w:t xml:space="preserve">, </w:t>
+        <w:t>success === false</w:t>
+      </w:r>
+    </w:p>
+    <w:p>
+      <w:pPr>
+        <w:spacing w:after="160" w:line="276" w:lineRule="auto"/>
+      </w:pPr>
+      <w:r>
+        <w:t xml:space="preserve">throws inside </w:t>
       </w:r>
       <w:r>
         <w:rPr>
@@ -8832,10 +9606,10 @@
           <w:sz w:val="20"/>
           <w:szCs w:val="20"/>
         </w:rPr>
-        <w:t>assigneeName</w:t>
-      </w:r>
-      <w:r>
-        <w:t xml:space="preserve">, </w:t>
+        <w:t>then</w:t>
+      </w:r>
+      <w:r>
+        <w:t xml:space="preserve"> so the shared </w:t>
       </w:r>
       <w:r>
         <w:rPr>
@@ -8843,10 +9617,10 @@
           <w:sz w:val="20"/>
           <w:szCs w:val="20"/>
         </w:rPr>
-        <w:t>isSelected</w:t>
-      </w:r>
-      <w:r>
-        <w:t xml:space="preserve">, a stable </w:t>
+        <w:t>catch</w:t>
+      </w:r>
+      <w:r>
+        <w:t xml:space="preserve"> toasts </w:t>
       </w:r>
       <w:r>
         <w:rPr>
@@ -8854,10 +9628,19 @@
           <w:sz w:val="20"/>
           <w:szCs w:val="20"/>
         </w:rPr>
-        <w:t>_key</w:t>
-      </w:r>
-      <w:r>
-        <w:t xml:space="preserve">, and </w:t>
+        <w:t>err.body?.message || err.message</w:t>
+      </w:r>
+      <w:r>
+        <w:t>.</w:t>
+      </w:r>
+    </w:p>
+    <w:p>
+      <w:pPr>
+        <w:spacing w:after="60" w:line="276" w:lineRule="auto"/>
+        <w:ind w:left="360" w:hanging="240"/>
+      </w:pPr>
+      <w:r>
+        <w:t xml:space="preserve">•  Page-level load failure sets </w:t>
       </w:r>
       <w:r>
         <w:rPr>
@@ -8865,10 +9648,21 @@
           <w:sz w:val="20"/>
           <w:szCs w:val="20"/>
         </w:rPr>
-        <w:t>dropIndicatorClass</w:t>
-      </w:r>
-      <w:r>
-        <w:t>.</w:t>
+        <w:t>errorMessage</w:t>
+      </w:r>
+      <w:r>
+        <w:t xml:space="preserve"> and hides content (</w:t>
+      </w:r>
+      <w:r>
+        <w:rPr>
+          <w:rFonts w:ascii="Consolas" w:hAnsi="Consolas" w:cs="Consolas"/>
+          <w:sz w:val="20"/>
+          <w:szCs w:val="20"/>
+        </w:rPr>
+        <w:t>shouldShowContent</w:t>
+      </w:r>
+      <w:r>
+        <w:t>).</w:t>
       </w:r>
     </w:p>
     <w:p>
@@ -8877,25 +9671,7 @@
         <w:ind w:left="360" w:hanging="240"/>
       </w:pPr>
       <w:r>
-        <w:t xml:space="preserve">•  </w:t>
-      </w:r>
-      <w:r>
-        <w:rPr>
-          <w:b/>
-          <w:bCs/>
-        </w:rPr>
-        <w:t>Mutators are "everywhere"-aware.</w:t>
-      </w:r>
-      <w:r>
-        <w:t xml:space="preserve"> Because a ticket can appear in the backlog and (when loaded)</w:t>
-      </w:r>
-    </w:p>
-    <w:p>
-      <w:pPr>
-        <w:spacing w:after="160" w:line="276" w:lineRule="auto"/>
-      </w:pPr>
-      <w:r>
-        <w:t xml:space="preserve">in a sprint, patches go through </w:t>
+        <w:t>•  Confirmations (</w:t>
       </w:r>
       <w:r>
         <w:rPr>
@@ -8903,307 +9679,26 @@
           <w:sz w:val="20"/>
           <w:szCs w:val="20"/>
         </w:rPr>
-        <w:t>_patchTicketEverywhere</w:t>
-      </w:r>
-      <w:r>
-        <w:t xml:space="preserve"> / </w:t>
-      </w:r>
-      <w:r>
-        <w:rPr>
-          <w:rFonts w:ascii="Consolas" w:hAnsi="Consolas" w:cs="Consolas"/>
-          <w:sz w:val="20"/>
-          <w:szCs w:val="20"/>
-        </w:rPr>
-        <w:t>_updateTicket…Everywhere</w:t>
-      </w:r>
-      <w:r>
-        <w:t xml:space="preserve"> so both copies stay consistent without a second fetch.</w:t>
-      </w:r>
-    </w:p>
-    <w:p>
-      <w:pPr>
-        <w:spacing w:after="60" w:line="276" w:lineRule="auto"/>
-        <w:ind w:left="360" w:hanging="240"/>
+        <w:t>_confirm</w:t>
+      </w:r>
+      <w:r>
+        <w:t>) gate destructive actions (sprint delete, bulk delete) behind the</w:t>
+      </w:r>
+    </w:p>
+    <w:p>
+      <w:pPr>
+        <w:spacing w:after="160" w:line="276" w:lineRule="auto"/>
+      </w:pPr>
+      <w:r>
+        <w:t>confirmation dialog before any Apex call.</w:t>
+      </w:r>
+    </w:p>
+    <w:p>
+      <w:pPr>
+        <w:pStyle w:val="Heading2"/>
       </w:pPr>
       <w:r>
         <w:lastRenderedPageBreak/>
-        <w:t xml:space="preserve">•  </w:t>
-      </w:r>
-      <w:r>
-        <w:rPr>
-          <w:b/>
-          <w:bCs/>
-        </w:rPr>
-        <w:t>Drag and drop.</w:t>
-      </w:r>
-      <w:r>
-        <w:t xml:space="preserve"> </w:t>
-      </w:r>
-      <w:r>
-        <w:rPr>
-          <w:rFonts w:ascii="Consolas" w:hAnsi="Consolas" w:cs="Consolas"/>
-          <w:sz w:val="20"/>
-          <w:szCs w:val="20"/>
-        </w:rPr>
-        <w:t>handlePageDragStart</w:t>
-      </w:r>
-      <w:r>
-        <w:t xml:space="preserve"> records the source container/ticket via DOM traversal</w:t>
-      </w:r>
-    </w:p>
-    <w:p>
-      <w:pPr>
-        <w:spacing w:after="160" w:line="276" w:lineRule="auto"/>
-      </w:pPr>
-      <w:r>
-        <w:t xml:space="preserve">(dataTransfer is empty on </w:t>
-      </w:r>
-      <w:r>
-        <w:rPr>
-          <w:rFonts w:ascii="Consolas" w:hAnsi="Consolas" w:cs="Consolas"/>
-          <w:sz w:val="20"/>
-          <w:szCs w:val="20"/>
-        </w:rPr>
-        <w:t>dragstart</w:t>
-      </w:r>
-      <w:r>
-        <w:t>). Sprint→different-sprint is blocked (</w:t>
-      </w:r>
-      <w:r>
-        <w:rPr>
-          <w:rFonts w:ascii="Consolas" w:hAnsi="Consolas" w:cs="Consolas"/>
-          <w:sz w:val="20"/>
-          <w:szCs w:val="20"/>
-        </w:rPr>
-        <w:t>dropEffect='none'</w:t>
-      </w:r>
-      <w:r>
-        <w:t xml:space="preserve">). Same-container drops route to </w:t>
-      </w:r>
-      <w:r>
-        <w:rPr>
-          <w:rFonts w:ascii="Consolas" w:hAnsi="Consolas" w:cs="Consolas"/>
-          <w:sz w:val="20"/>
-          <w:szCs w:val="20"/>
-        </w:rPr>
-        <w:t>moveTicketPosition</w:t>
-      </w:r>
-      <w:r>
-        <w:t xml:space="preserve"> (reorder); cross-container drops route to </w:t>
-      </w:r>
-      <w:r>
-        <w:rPr>
-          <w:rFonts w:ascii="Consolas" w:hAnsi="Consolas" w:cs="Consolas"/>
-          <w:sz w:val="20"/>
-          <w:szCs w:val="20"/>
-        </w:rPr>
-        <w:t>moveTicketToSprint</w:t>
-      </w:r>
-      <w:r>
-        <w:t xml:space="preserve"> / </w:t>
-      </w:r>
-      <w:r>
-        <w:rPr>
-          <w:rFonts w:ascii="Consolas" w:hAnsi="Consolas" w:cs="Consolas"/>
-          <w:sz w:val="20"/>
-          <w:szCs w:val="20"/>
-        </w:rPr>
-        <w:t>moveTicketToBacklog</w:t>
-      </w:r>
-      <w:r>
-        <w:t>. Top drop-zones allow inserting before the first item.</w:t>
-      </w:r>
-    </w:p>
-    <w:p>
-      <w:pPr>
-        <w:spacing w:after="60" w:line="276" w:lineRule="auto"/>
-        <w:ind w:left="360" w:hanging="240"/>
-      </w:pPr>
-      <w:r>
-        <w:t xml:space="preserve">•  </w:t>
-      </w:r>
-      <w:r>
-        <w:rPr>
-          <w:b/>
-          <w:bCs/>
-        </w:rPr>
-        <w:t>Optimistic revert.</w:t>
-      </w:r>
-      <w:r>
-        <w:t xml:space="preserve"> On a failed status change the ticket is re-keyed (</w:t>
-      </w:r>
-      <w:r>
-        <w:rPr>
-          <w:rFonts w:ascii="Consolas" w:hAnsi="Consolas" w:cs="Consolas"/>
-          <w:sz w:val="20"/>
-          <w:szCs w:val="20"/>
-        </w:rPr>
-        <w:t>_reKeyTicket</w:t>
-      </w:r>
-      <w:r>
-        <w:t>) to force the</w:t>
-      </w:r>
-    </w:p>
-    <w:p>
-      <w:pPr>
-        <w:spacing w:after="160" w:line="276" w:lineRule="auto"/>
-      </w:pPr>
-      <w:r>
-        <w:t>combo to re-render its server value.</w:t>
-      </w:r>
-    </w:p>
-    <w:p>
-      <w:pPr>
-        <w:pStyle w:val="Heading2"/>
-      </w:pPr>
-      <w:r>
-        <w:t>6. Error Handling &amp; Loading</w:t>
-      </w:r>
-    </w:p>
-    <w:p>
-      <w:pPr>
-        <w:spacing w:after="60" w:line="276" w:lineRule="auto"/>
-        <w:ind w:left="360" w:hanging="240"/>
-      </w:pPr>
-      <w:r>
-        <w:t xml:space="preserve">•  Each imperative call sets </w:t>
-      </w:r>
-      <w:r>
-        <w:rPr>
-          <w:rFonts w:ascii="Consolas" w:hAnsi="Consolas" w:cs="Consolas"/>
-          <w:sz w:val="20"/>
-          <w:szCs w:val="20"/>
-        </w:rPr>
-        <w:t>isLoading = true</w:t>
-      </w:r>
-      <w:r>
-        <w:t xml:space="preserve">, then in </w:t>
-      </w:r>
-      <w:r>
-        <w:rPr>
-          <w:rFonts w:ascii="Consolas" w:hAnsi="Consolas" w:cs="Consolas"/>
-          <w:sz w:val="20"/>
-          <w:szCs w:val="20"/>
-        </w:rPr>
-        <w:t>finally</w:t>
-      </w:r>
-      <w:r>
-        <w:t xml:space="preserve"> resets it; </w:t>
-      </w:r>
-      <w:r>
-        <w:rPr>
-          <w:rFonts w:ascii="Consolas" w:hAnsi="Consolas" w:cs="Consolas"/>
-          <w:sz w:val="20"/>
-          <w:szCs w:val="20"/>
-        </w:rPr>
-        <w:t>success === false</w:t>
-      </w:r>
-    </w:p>
-    <w:p>
-      <w:pPr>
-        <w:spacing w:after="160" w:line="276" w:lineRule="auto"/>
-      </w:pPr>
-      <w:r>
-        <w:t xml:space="preserve">throws inside </w:t>
-      </w:r>
-      <w:r>
-        <w:rPr>
-          <w:rFonts w:ascii="Consolas" w:hAnsi="Consolas" w:cs="Consolas"/>
-          <w:sz w:val="20"/>
-          <w:szCs w:val="20"/>
-        </w:rPr>
-        <w:t>then</w:t>
-      </w:r>
-      <w:r>
-        <w:t xml:space="preserve"> so the shared </w:t>
-      </w:r>
-      <w:r>
-        <w:rPr>
-          <w:rFonts w:ascii="Consolas" w:hAnsi="Consolas" w:cs="Consolas"/>
-          <w:sz w:val="20"/>
-          <w:szCs w:val="20"/>
-        </w:rPr>
-        <w:t>catch</w:t>
-      </w:r>
-      <w:r>
-        <w:t xml:space="preserve"> toasts </w:t>
-      </w:r>
-      <w:r>
-        <w:rPr>
-          <w:rFonts w:ascii="Consolas" w:hAnsi="Consolas" w:cs="Consolas"/>
-          <w:sz w:val="20"/>
-          <w:szCs w:val="20"/>
-        </w:rPr>
-        <w:t>err.body?.message || err.message</w:t>
-      </w:r>
-      <w:r>
-        <w:t>.</w:t>
-      </w:r>
-    </w:p>
-    <w:p>
-      <w:pPr>
-        <w:spacing w:after="60" w:line="276" w:lineRule="auto"/>
-        <w:ind w:left="360" w:hanging="240"/>
-      </w:pPr>
-      <w:r>
-        <w:t xml:space="preserve">•  Page-level load failure sets </w:t>
-      </w:r>
-      <w:r>
-        <w:rPr>
-          <w:rFonts w:ascii="Consolas" w:hAnsi="Consolas" w:cs="Consolas"/>
-          <w:sz w:val="20"/>
-          <w:szCs w:val="20"/>
-        </w:rPr>
-        <w:t>errorMessage</w:t>
-      </w:r>
-      <w:r>
-        <w:t xml:space="preserve"> and hides content (</w:t>
-      </w:r>
-      <w:r>
-        <w:rPr>
-          <w:rFonts w:ascii="Consolas" w:hAnsi="Consolas" w:cs="Consolas"/>
-          <w:sz w:val="20"/>
-          <w:szCs w:val="20"/>
-        </w:rPr>
-        <w:t>shouldShowContent</w:t>
-      </w:r>
-      <w:r>
-        <w:t>).</w:t>
-      </w:r>
-    </w:p>
-    <w:p>
-      <w:pPr>
-        <w:spacing w:after="60" w:line="276" w:lineRule="auto"/>
-        <w:ind w:left="360" w:hanging="240"/>
-      </w:pPr>
-      <w:r>
-        <w:t>•  Confirmations (</w:t>
-      </w:r>
-      <w:r>
-        <w:rPr>
-          <w:rFonts w:ascii="Consolas" w:hAnsi="Consolas" w:cs="Consolas"/>
-          <w:sz w:val="20"/>
-          <w:szCs w:val="20"/>
-        </w:rPr>
-        <w:t>_confirm</w:t>
-      </w:r>
-      <w:r>
-        <w:t>) gate destructive actions (sprint delete, bulk delete) behind the</w:t>
-      </w:r>
-    </w:p>
-    <w:p>
-      <w:pPr>
-        <w:spacing w:after="160" w:line="276" w:lineRule="auto"/>
-      </w:pPr>
-      <w:r>
-        <w:t>confirmation dialog before any Apex call.</w:t>
-      </w:r>
-    </w:p>
-    <w:p>
-      <w:pPr>
-        <w:pStyle w:val="Heading2"/>
-      </w:pPr>
-      <w:r>
         <w:t>7. Traceability (SRS → API)</w:t>
       </w:r>
     </w:p>
@@ -9922,7 +10417,6 @@
           </w:tcPr>
           <w:p>
             <w:r>
-              <w:lastRenderedPageBreak/>
               <w:t>FR-25 peek panel links</w:t>
             </w:r>
           </w:p>
@@ -9989,11 +10483,9 @@
       <w:tr>
         <w:tc>
           <w:tcPr>
-            <w:tcW w:type="dxa" w:w="4680"/>
-          </w:tcPr>
-          <w:p>
-            <w:pPr/>
-            <w:r/>
+            <w:tcW w:w="4680" w:type="dxa"/>
+          </w:tcPr>
+          <w:p>
             <w:r>
               <w:t>FR-26..FR-31 ticket view panel</w:t>
             </w:r>
@@ -10001,11 +10493,9 @@
         </w:tc>
         <w:tc>
           <w:tcPr>
-            <w:tcW w:type="dxa" w:w="4680"/>
-          </w:tcPr>
-          <w:p>
-            <w:pPr/>
-            <w:r/>
+            <w:tcW w:w="4680" w:type="dxa"/>
+          </w:tcPr>
+          <w:p>
             <w:r>
               <w:rPr>
                 <w:rFonts w:ascii="Consolas" w:hAnsi="Consolas" w:cs="Consolas"/>
@@ -10650,6 +11140,7 @@
   <w:style w:type="paragraph" w:default="1" w:styleId="Normal">
     <w:name w:val="Normal"/>
     <w:qFormat/>
+    <w:rsid w:val="00EA0CBC"/>
   </w:style>
   <w:style w:type="paragraph" w:styleId="Heading1">
     <w:name w:val="heading 1"/>

</xml_diff>